<commit_message>
fix: recover Word multilevel list numbering properly (solves alternative letters disappearing when using Word lists)
</commit_message>
<xml_diff>
--- a/debug.docx
+++ b/debug.docx
@@ -11,6 +11,7 @@
         <w:spacing w:line="360" w:lineRule="auto"/>
         <w:rPr>
           <w:sz w:val="24"/>
+          <w:szCs w:val="36"/>
         </w:rPr>
       </w:pPr>
       <w:r>
@@ -27,59 +28,105 @@
       </w:r>
       <w:r>
         <w:rPr>
-          <w:color w:val="EE0000"/>
-          <w:sz w:val="24"/>
-        </w:rPr>
-        <w:t xml:space="preserve">A) Vibrações que se propagam pelos materiais e podem ser percebidas pelo ouvido. </w:t>
+          <w:sz w:val="24"/>
+        </w:rPr>
+        <w:t xml:space="preserve">a. </w:t>
       </w:r>
+      <w:proofErr w:type="spellStart"/>
       <w:r>
         <w:rPr>
-          <w:color w:val="EE0000"/>
-          <w:sz w:val="24"/>
+          <w:sz w:val="24"/>
+        </w:rPr>
+        <w:t>asfkasfsakfskafas</w:t>
+      </w:r>
+      <w:proofErr w:type="spellEnd"/>
+      <w:r>
+        <w:rPr>
+          <w:sz w:val="24"/>
+          <w:szCs w:val="36"/>
         </w:rPr>
         <w:br/>
+        <w:t xml:space="preserve">b. </w:t>
       </w:r>
+      <w:proofErr w:type="spellStart"/>
       <w:r>
         <w:rPr>
           <w:sz w:val="24"/>
-        </w:rPr>
-        <w:t>B) Sons que são captados apenas por microfones.</w:t>
+          <w:szCs w:val="36"/>
+        </w:rPr>
+        <w:t>fafiafaspfoasf</w:t>
       </w:r>
+      <w:proofErr w:type="spellEnd"/>
       <w:r>
         <w:rPr>
           <w:sz w:val="24"/>
+          <w:szCs w:val="36"/>
         </w:rPr>
         <w:br/>
-        <w:t>C) Movimentos de ar sem relação com o som.</w:t>
+        <w:t xml:space="preserve">c. </w:t>
       </w:r>
+      <w:proofErr w:type="spellStart"/>
       <w:r>
         <w:rPr>
           <w:sz w:val="24"/>
+          <w:szCs w:val="36"/>
+        </w:rPr>
+        <w:t>afasjfoaifjaf</w:t>
+      </w:r>
+      <w:proofErr w:type="spellEnd"/>
+      <w:r>
+        <w:rPr>
+          <w:sz w:val="24"/>
+          <w:szCs w:val="36"/>
         </w:rPr>
         <w:br/>
-        <w:t>D) Frequências que só podem ser medidas por computadores.</w:t>
+        <w:t xml:space="preserve">d. </w:t>
       </w:r>
+      <w:proofErr w:type="spellStart"/>
       <w:r>
         <w:rPr>
           <w:sz w:val="24"/>
+          <w:szCs w:val="36"/>
+        </w:rPr>
+        <w:t>asfnajsfjaksf</w:t>
+      </w:r>
+      <w:proofErr w:type="spellEnd"/>
+      <w:r>
+        <w:rPr>
+          <w:sz w:val="24"/>
+          <w:szCs w:val="36"/>
         </w:rPr>
         <w:br/>
-        <w:t xml:space="preserve">E) Silêncios que ocorrem entre notas musicais. </w:t>
+        <w:t xml:space="preserve">e. </w:t>
       </w:r>
+      <w:proofErr w:type="spellStart"/>
       <w:r>
         <w:rPr>
           <w:sz w:val="24"/>
-        </w:rPr>
-        <w:br/>
+          <w:szCs w:val="36"/>
+        </w:rPr>
+        <w:t>afaosfasifiasf</w:t>
       </w:r>
+      <w:proofErr w:type="spellEnd"/>
+    </w:p>
+    <w:p>
+      <w:pPr>
+        <w:spacing w:line="360" w:lineRule="auto"/>
+        <w:ind w:left="-284"/>
+        <w:rPr>
+          <w:sz w:val="24"/>
+          <w:szCs w:val="36"/>
+        </w:rPr>
+      </w:pPr>
     </w:p>
     <w:p>
       <w:pPr>
         <w:pStyle w:val="PargrafodaLista"/>
         <w:numPr>
           <w:ilvl w:val="0"/>
-          <w:numId w:val="3"/>
+          <w:numId w:val="13"/>
         </w:numPr>
+        <w:spacing w:line="360" w:lineRule="auto"/>
         <w:ind w:left="0" w:hanging="284"/>
         <w:rPr>
           <w:sz w:val="24"/>
@@ -89,7 +136,6 @@
       <w:r>
         <w:rPr>
           <w:sz w:val="24"/>
-          <w:szCs w:val="36"/>
         </w:rPr>
         <w:t>O que são ondas sonoras?</w:t>
       </w:r>
@@ -99,20 +145,157 @@
         <w:pStyle w:val="PargrafodaLista"/>
         <w:numPr>
           <w:ilvl w:val="0"/>
-          <w:numId w:val="4"/>
+          <w:numId w:val="10"/>
         </w:numPr>
-        <w:rPr>
-          <w:color w:val="EE0000"/>
-          <w:sz w:val="24"/>
-          <w:szCs w:val="36"/>
-        </w:rPr>
-      </w:pPr>
+        <w:spacing w:line="360" w:lineRule="auto"/>
+        <w:ind w:left="284" w:hanging="284"/>
+        <w:rPr>
+          <w:sz w:val="24"/>
+          <w:szCs w:val="36"/>
+        </w:rPr>
+      </w:pPr>
+      <w:proofErr w:type="spellStart"/>
       <w:r>
         <w:rPr>
-          <w:color w:val="EE0000"/>
-          <w:sz w:val="24"/>
-        </w:rPr>
-        <w:t>Vibrações que se propagam pelos materiais e podem ser percebidas pelo ouvido.</w:t>
+          <w:sz w:val="24"/>
+          <w:szCs w:val="36"/>
+        </w:rPr>
+        <w:t>Asfjosafiasfjsaf</w:t>
+      </w:r>
+      <w:proofErr w:type="spellEnd"/>
+    </w:p>
+    <w:p>
+      <w:pPr>
+        <w:pStyle w:val="PargrafodaLista"/>
+        <w:numPr>
+          <w:ilvl w:val="0"/>
+          <w:numId w:val="10"/>
+        </w:numPr>
+        <w:spacing w:line="360" w:lineRule="auto"/>
+        <w:ind w:left="284" w:hanging="284"/>
+        <w:rPr>
+          <w:sz w:val="24"/>
+          <w:szCs w:val="36"/>
+        </w:rPr>
+      </w:pPr>
+      <w:proofErr w:type="spellStart"/>
+      <w:r>
+        <w:rPr>
+          <w:sz w:val="24"/>
+          <w:szCs w:val="36"/>
+        </w:rPr>
+        <w:t>Asfasfasfasfsf</w:t>
+      </w:r>
+      <w:proofErr w:type="spellEnd"/>
+    </w:p>
+    <w:p>
+      <w:pPr>
+        <w:pStyle w:val="PargrafodaLista"/>
+        <w:numPr>
+          <w:ilvl w:val="0"/>
+          <w:numId w:val="10"/>
+        </w:numPr>
+        <w:spacing w:line="360" w:lineRule="auto"/>
+        <w:ind w:left="284" w:hanging="284"/>
+        <w:rPr>
+          <w:sz w:val="24"/>
+          <w:szCs w:val="36"/>
+        </w:rPr>
+      </w:pPr>
+      <w:proofErr w:type="spellStart"/>
+      <w:r>
+        <w:rPr>
+          <w:sz w:val="24"/>
+          <w:szCs w:val="36"/>
+        </w:rPr>
+        <w:t>Safsafasfsa</w:t>
+      </w:r>
+      <w:proofErr w:type="spellEnd"/>
+    </w:p>
+    <w:p>
+      <w:pPr>
+        <w:pStyle w:val="PargrafodaLista"/>
+        <w:numPr>
+          <w:ilvl w:val="0"/>
+          <w:numId w:val="10"/>
+        </w:numPr>
+        <w:spacing w:line="360" w:lineRule="auto"/>
+        <w:ind w:left="284" w:hanging="284"/>
+        <w:rPr>
+          <w:sz w:val="24"/>
+          <w:szCs w:val="36"/>
+        </w:rPr>
+      </w:pPr>
+      <w:proofErr w:type="spellStart"/>
+      <w:r>
+        <w:rPr>
+          <w:sz w:val="24"/>
+          <w:szCs w:val="36"/>
+        </w:rPr>
+        <w:t>Afsafasfasf</w:t>
+      </w:r>
+      <w:proofErr w:type="spellEnd"/>
+    </w:p>
+    <w:p>
+      <w:pPr>
+        <w:pStyle w:val="PargrafodaLista"/>
+        <w:numPr>
+          <w:ilvl w:val="0"/>
+          <w:numId w:val="10"/>
+        </w:numPr>
+        <w:spacing w:line="360" w:lineRule="auto"/>
+        <w:ind w:left="284" w:hanging="284"/>
+        <w:rPr>
+          <w:sz w:val="24"/>
+          <w:szCs w:val="36"/>
+        </w:rPr>
+      </w:pPr>
+      <w:proofErr w:type="spellStart"/>
+      <w:r>
+        <w:rPr>
+          <w:sz w:val="24"/>
+          <w:szCs w:val="36"/>
+        </w:rPr>
+        <w:t>A</w:t>
+      </w:r>
+      <w:r>
+        <w:rPr>
+          <w:sz w:val="24"/>
+          <w:szCs w:val="36"/>
+        </w:rPr>
+        <w:t>fsasfasf</w:t>
+      </w:r>
+      <w:proofErr w:type="spellEnd"/>
+    </w:p>
+    <w:p>
+      <w:pPr>
+        <w:spacing w:line="360" w:lineRule="auto"/>
+        <w:rPr>
+          <w:sz w:val="24"/>
+          <w:szCs w:val="36"/>
+        </w:rPr>
+      </w:pPr>
+    </w:p>
+    <w:p>
+      <w:pPr>
+        <w:pStyle w:val="PargrafodaLista"/>
+        <w:numPr>
+          <w:ilvl w:val="0"/>
+          <w:numId w:val="14"/>
+        </w:numPr>
+        <w:spacing w:line="360" w:lineRule="auto"/>
+        <w:ind w:left="0" w:hanging="284"/>
+        <w:rPr>
+          <w:sz w:val="24"/>
+          <w:szCs w:val="36"/>
+        </w:rPr>
+      </w:pPr>
+      <w:r>
+        <w:rPr>
+          <w:sz w:val="24"/>
+          <w:szCs w:val="36"/>
+        </w:rPr>
+        <w:t>O que são ondas sonoras?</w:t>
       </w:r>
     </w:p>
     <w:p>
@@ -120,82 +303,120 @@
         <w:pStyle w:val="PargrafodaLista"/>
         <w:numPr>
           <w:ilvl w:val="0"/>
-          <w:numId w:val="4"/>
+          <w:numId w:val="12"/>
         </w:numPr>
-        <w:rPr>
-          <w:sz w:val="24"/>
-          <w:szCs w:val="36"/>
-        </w:rPr>
-      </w:pPr>
+        <w:spacing w:line="360" w:lineRule="auto"/>
+        <w:ind w:left="284" w:hanging="284"/>
+        <w:rPr>
+          <w:sz w:val="24"/>
+          <w:szCs w:val="36"/>
+        </w:rPr>
+      </w:pPr>
+      <w:proofErr w:type="spellStart"/>
       <w:r>
         <w:rPr>
           <w:sz w:val="24"/>
-        </w:rPr>
-        <w:t xml:space="preserve"> </w:t>
+          <w:szCs w:val="36"/>
+        </w:rPr>
+        <w:t>Pafjapofopasf</w:t>
       </w:r>
-      <w:r>
-        <w:rPr>
-          <w:sz w:val="24"/>
-        </w:rPr>
-        <w:t>Sons que são captados apenas por microfones.</w:t>
-      </w:r>
+      <w:proofErr w:type="spellEnd"/>
     </w:p>
     <w:p>
       <w:pPr>
         <w:pStyle w:val="PargrafodaLista"/>
         <w:numPr>
           <w:ilvl w:val="0"/>
-          <w:numId w:val="4"/>
+          <w:numId w:val="12"/>
         </w:numPr>
-        <w:rPr>
-          <w:sz w:val="24"/>
-          <w:szCs w:val="36"/>
-        </w:rPr>
-      </w:pPr>
+        <w:spacing w:line="360" w:lineRule="auto"/>
+        <w:ind w:left="284" w:hanging="284"/>
+        <w:rPr>
+          <w:sz w:val="24"/>
+          <w:szCs w:val="36"/>
+        </w:rPr>
+      </w:pPr>
+      <w:proofErr w:type="spellStart"/>
       <w:r>
         <w:rPr>
           <w:sz w:val="24"/>
-        </w:rPr>
-        <w:t xml:space="preserve"> Movimentos de ar sem relação com o som.</w:t>
+          <w:szCs w:val="36"/>
+        </w:rPr>
+        <w:t>Asfafasfsafasf</w:t>
       </w:r>
+      <w:proofErr w:type="spellEnd"/>
     </w:p>
     <w:p>
       <w:pPr>
         <w:pStyle w:val="PargrafodaLista"/>
         <w:numPr>
           <w:ilvl w:val="0"/>
-          <w:numId w:val="4"/>
+          <w:numId w:val="12"/>
         </w:numPr>
-        <w:rPr>
-          <w:sz w:val="24"/>
-          <w:szCs w:val="36"/>
-        </w:rPr>
-      </w:pPr>
+        <w:spacing w:line="360" w:lineRule="auto"/>
+        <w:ind w:left="284" w:hanging="284"/>
+        <w:rPr>
+          <w:sz w:val="24"/>
+          <w:szCs w:val="36"/>
+        </w:rPr>
+      </w:pPr>
+      <w:proofErr w:type="spellStart"/>
       <w:r>
         <w:rPr>
           <w:sz w:val="24"/>
-        </w:rPr>
-        <w:t xml:space="preserve"> Frequências que só podem ser medidas por computadores.</w:t>
+          <w:szCs w:val="36"/>
+        </w:rPr>
+        <w:t>Asfafasfasfasf</w:t>
       </w:r>
+      <w:proofErr w:type="spellEnd"/>
     </w:p>
     <w:p>
       <w:pPr>
         <w:pStyle w:val="PargrafodaLista"/>
         <w:numPr>
           <w:ilvl w:val="0"/>
-          <w:numId w:val="4"/>
+          <w:numId w:val="12"/>
         </w:numPr>
-        <w:rPr>
-          <w:sz w:val="24"/>
-          <w:szCs w:val="36"/>
-        </w:rPr>
-      </w:pPr>
+        <w:spacing w:line="360" w:lineRule="auto"/>
+        <w:ind w:left="284" w:hanging="284"/>
+        <w:rPr>
+          <w:sz w:val="24"/>
+          <w:szCs w:val="36"/>
+        </w:rPr>
+      </w:pPr>
+      <w:proofErr w:type="spellStart"/>
       <w:r>
         <w:rPr>
           <w:sz w:val="24"/>
-        </w:rPr>
-        <w:t>Silêncios que ocorrem entre notas musicais.</w:t>
+          <w:szCs w:val="36"/>
+        </w:rPr>
+        <w:t>Asfafsafsa</w:t>
       </w:r>
+      <w:proofErr w:type="spellEnd"/>
+    </w:p>
+    <w:p>
+      <w:pPr>
+        <w:pStyle w:val="PargrafodaLista"/>
+        <w:numPr>
+          <w:ilvl w:val="0"/>
+          <w:numId w:val="12"/>
+        </w:numPr>
+        <w:spacing w:line="360" w:lineRule="auto"/>
+        <w:ind w:left="284" w:hanging="284"/>
+        <w:rPr>
+          <w:sz w:val="24"/>
+          <w:szCs w:val="36"/>
+        </w:rPr>
+      </w:pPr>
+      <w:proofErr w:type="spellStart"/>
+      <w:r>
+        <w:rPr>
+          <w:sz w:val="24"/>
+          <w:szCs w:val="36"/>
+        </w:rPr>
+        <w:t>afssafsafaf</w:t>
+      </w:r>
+      <w:proofErr w:type="spellEnd"/>
     </w:p>
     <w:sectPr>
       <w:pgSz w:w="11906" w:h="16838"/>
@@ -232,6 +453,629 @@
     </w:lvl>
   </w:abstractNum>
   <w:abstractNum w:abstractNumId="1" w15:restartNumberingAfterBreak="0">
+    <w:nsid w:val="08304252"/>
+    <w:multiLevelType w:val="hybridMultilevel"/>
+    <w:tmpl w:val="C71E4570"/>
+    <w:lvl w:ilvl="0" w:tplc="C4B25CAC">
+      <w:start w:val="2"/>
+      <w:numFmt w:val="decimal"/>
+      <w:lvlText w:val="%1-"/>
+      <w:lvlJc w:val="left"/>
+      <w:pPr>
+        <w:ind w:left="720" w:hanging="360"/>
+      </w:pPr>
+      <w:rPr>
+        <w:rFonts w:hint="default"/>
+      </w:rPr>
+    </w:lvl>
+    <w:lvl w:ilvl="1" w:tplc="04160019" w:tentative="1">
+      <w:start w:val="1"/>
+      <w:numFmt w:val="lowerLetter"/>
+      <w:lvlText w:val="%2."/>
+      <w:lvlJc w:val="left"/>
+      <w:pPr>
+        <w:ind w:left="1440" w:hanging="360"/>
+      </w:pPr>
+    </w:lvl>
+    <w:lvl w:ilvl="2" w:tplc="0416001B" w:tentative="1">
+      <w:start w:val="1"/>
+      <w:numFmt w:val="lowerRoman"/>
+      <w:lvlText w:val="%3."/>
+      <w:lvlJc w:val="right"/>
+      <w:pPr>
+        <w:ind w:left="2160" w:hanging="180"/>
+      </w:pPr>
+    </w:lvl>
+    <w:lvl w:ilvl="3" w:tplc="0416000F" w:tentative="1">
+      <w:start w:val="1"/>
+      <w:numFmt w:val="decimal"/>
+      <w:lvlText w:val="%4."/>
+      <w:lvlJc w:val="left"/>
+      <w:pPr>
+        <w:ind w:left="2880" w:hanging="360"/>
+      </w:pPr>
+    </w:lvl>
+    <w:lvl w:ilvl="4" w:tplc="04160019" w:tentative="1">
+      <w:start w:val="1"/>
+      <w:numFmt w:val="lowerLetter"/>
+      <w:lvlText w:val="%5."/>
+      <w:lvlJc w:val="left"/>
+      <w:pPr>
+        <w:ind w:left="3600" w:hanging="360"/>
+      </w:pPr>
+    </w:lvl>
+    <w:lvl w:ilvl="5" w:tplc="0416001B" w:tentative="1">
+      <w:start w:val="1"/>
+      <w:numFmt w:val="lowerRoman"/>
+      <w:lvlText w:val="%6."/>
+      <w:lvlJc w:val="right"/>
+      <w:pPr>
+        <w:ind w:left="4320" w:hanging="180"/>
+      </w:pPr>
+    </w:lvl>
+    <w:lvl w:ilvl="6" w:tplc="0416000F" w:tentative="1">
+      <w:start w:val="1"/>
+      <w:numFmt w:val="decimal"/>
+      <w:lvlText w:val="%7."/>
+      <w:lvlJc w:val="left"/>
+      <w:pPr>
+        <w:ind w:left="5040" w:hanging="360"/>
+      </w:pPr>
+    </w:lvl>
+    <w:lvl w:ilvl="7" w:tplc="04160019" w:tentative="1">
+      <w:start w:val="1"/>
+      <w:numFmt w:val="lowerLetter"/>
+      <w:lvlText w:val="%8."/>
+      <w:lvlJc w:val="left"/>
+      <w:pPr>
+        <w:ind w:left="5760" w:hanging="360"/>
+      </w:pPr>
+    </w:lvl>
+    <w:lvl w:ilvl="8" w:tplc="0416001B" w:tentative="1">
+      <w:start w:val="1"/>
+      <w:numFmt w:val="lowerRoman"/>
+      <w:lvlText w:val="%9."/>
+      <w:lvlJc w:val="right"/>
+      <w:pPr>
+        <w:ind w:left="6480" w:hanging="180"/>
+      </w:pPr>
+    </w:lvl>
+  </w:abstractNum>
+  <w:abstractNum w:abstractNumId="2" w15:restartNumberingAfterBreak="0">
+    <w:nsid w:val="0D117B6D"/>
+    <w:multiLevelType w:val="hybridMultilevel"/>
+    <w:tmpl w:val="A2807F7E"/>
+    <w:lvl w:ilvl="0" w:tplc="04160017">
+      <w:start w:val="1"/>
+      <w:numFmt w:val="lowerLetter"/>
+      <w:lvlText w:val="%1)"/>
+      <w:lvlJc w:val="left"/>
+      <w:pPr>
+        <w:ind w:left="720" w:hanging="360"/>
+      </w:pPr>
+      <w:rPr>
+        <w:rFonts w:hint="default"/>
+      </w:rPr>
+    </w:lvl>
+    <w:lvl w:ilvl="1" w:tplc="04160019" w:tentative="1">
+      <w:start w:val="1"/>
+      <w:numFmt w:val="lowerLetter"/>
+      <w:lvlText w:val="%2."/>
+      <w:lvlJc w:val="left"/>
+      <w:pPr>
+        <w:ind w:left="1440" w:hanging="360"/>
+      </w:pPr>
+    </w:lvl>
+    <w:lvl w:ilvl="2" w:tplc="0416001B" w:tentative="1">
+      <w:start w:val="1"/>
+      <w:numFmt w:val="lowerRoman"/>
+      <w:lvlText w:val="%3."/>
+      <w:lvlJc w:val="right"/>
+      <w:pPr>
+        <w:ind w:left="2160" w:hanging="180"/>
+      </w:pPr>
+    </w:lvl>
+    <w:lvl w:ilvl="3" w:tplc="0416000F" w:tentative="1">
+      <w:start w:val="1"/>
+      <w:numFmt w:val="decimal"/>
+      <w:lvlText w:val="%4."/>
+      <w:lvlJc w:val="left"/>
+      <w:pPr>
+        <w:ind w:left="2880" w:hanging="360"/>
+      </w:pPr>
+    </w:lvl>
+    <w:lvl w:ilvl="4" w:tplc="04160019" w:tentative="1">
+      <w:start w:val="1"/>
+      <w:numFmt w:val="lowerLetter"/>
+      <w:lvlText w:val="%5."/>
+      <w:lvlJc w:val="left"/>
+      <w:pPr>
+        <w:ind w:left="3600" w:hanging="360"/>
+      </w:pPr>
+    </w:lvl>
+    <w:lvl w:ilvl="5" w:tplc="0416001B" w:tentative="1">
+      <w:start w:val="1"/>
+      <w:numFmt w:val="lowerRoman"/>
+      <w:lvlText w:val="%6."/>
+      <w:lvlJc w:val="right"/>
+      <w:pPr>
+        <w:ind w:left="4320" w:hanging="180"/>
+      </w:pPr>
+    </w:lvl>
+    <w:lvl w:ilvl="6" w:tplc="0416000F" w:tentative="1">
+      <w:start w:val="1"/>
+      <w:numFmt w:val="decimal"/>
+      <w:lvlText w:val="%7."/>
+      <w:lvlJc w:val="left"/>
+      <w:pPr>
+        <w:ind w:left="5040" w:hanging="360"/>
+      </w:pPr>
+    </w:lvl>
+    <w:lvl w:ilvl="7" w:tplc="04160019" w:tentative="1">
+      <w:start w:val="1"/>
+      <w:numFmt w:val="lowerLetter"/>
+      <w:lvlText w:val="%8."/>
+      <w:lvlJc w:val="left"/>
+      <w:pPr>
+        <w:ind w:left="5760" w:hanging="360"/>
+      </w:pPr>
+    </w:lvl>
+    <w:lvl w:ilvl="8" w:tplc="0416001B" w:tentative="1">
+      <w:start w:val="1"/>
+      <w:numFmt w:val="lowerRoman"/>
+      <w:lvlText w:val="%9."/>
+      <w:lvlJc w:val="right"/>
+      <w:pPr>
+        <w:ind w:left="6480" w:hanging="180"/>
+      </w:pPr>
+    </w:lvl>
+  </w:abstractNum>
+  <w:abstractNum w:abstractNumId="3" w15:restartNumberingAfterBreak="0">
+    <w:nsid w:val="10216BA5"/>
+    <w:multiLevelType w:val="hybridMultilevel"/>
+    <w:tmpl w:val="96D04448"/>
+    <w:lvl w:ilvl="0" w:tplc="04160011">
+      <w:start w:val="3"/>
+      <w:numFmt w:val="decimal"/>
+      <w:lvlText w:val="%1)"/>
+      <w:lvlJc w:val="left"/>
+      <w:pPr>
+        <w:ind w:left="720" w:hanging="360"/>
+      </w:pPr>
+      <w:rPr>
+        <w:rFonts w:hint="default"/>
+      </w:rPr>
+    </w:lvl>
+    <w:lvl w:ilvl="1" w:tplc="04160019" w:tentative="1">
+      <w:start w:val="1"/>
+      <w:numFmt w:val="lowerLetter"/>
+      <w:lvlText w:val="%2."/>
+      <w:lvlJc w:val="left"/>
+      <w:pPr>
+        <w:ind w:left="1440" w:hanging="360"/>
+      </w:pPr>
+    </w:lvl>
+    <w:lvl w:ilvl="2" w:tplc="0416001B" w:tentative="1">
+      <w:start w:val="1"/>
+      <w:numFmt w:val="lowerRoman"/>
+      <w:lvlText w:val="%3."/>
+      <w:lvlJc w:val="right"/>
+      <w:pPr>
+        <w:ind w:left="2160" w:hanging="180"/>
+      </w:pPr>
+    </w:lvl>
+    <w:lvl w:ilvl="3" w:tplc="0416000F" w:tentative="1">
+      <w:start w:val="1"/>
+      <w:numFmt w:val="decimal"/>
+      <w:lvlText w:val="%4."/>
+      <w:lvlJc w:val="left"/>
+      <w:pPr>
+        <w:ind w:left="2880" w:hanging="360"/>
+      </w:pPr>
+    </w:lvl>
+    <w:lvl w:ilvl="4" w:tplc="04160019" w:tentative="1">
+      <w:start w:val="1"/>
+      <w:numFmt w:val="lowerLetter"/>
+      <w:lvlText w:val="%5."/>
+      <w:lvlJc w:val="left"/>
+      <w:pPr>
+        <w:ind w:left="3600" w:hanging="360"/>
+      </w:pPr>
+    </w:lvl>
+    <w:lvl w:ilvl="5" w:tplc="0416001B" w:tentative="1">
+      <w:start w:val="1"/>
+      <w:numFmt w:val="lowerRoman"/>
+      <w:lvlText w:val="%6."/>
+      <w:lvlJc w:val="right"/>
+      <w:pPr>
+        <w:ind w:left="4320" w:hanging="180"/>
+      </w:pPr>
+    </w:lvl>
+    <w:lvl w:ilvl="6" w:tplc="0416000F" w:tentative="1">
+      <w:start w:val="1"/>
+      <w:numFmt w:val="decimal"/>
+      <w:lvlText w:val="%7."/>
+      <w:lvlJc w:val="left"/>
+      <w:pPr>
+        <w:ind w:left="5040" w:hanging="360"/>
+      </w:pPr>
+    </w:lvl>
+    <w:lvl w:ilvl="7" w:tplc="04160019" w:tentative="1">
+      <w:start w:val="1"/>
+      <w:numFmt w:val="lowerLetter"/>
+      <w:lvlText w:val="%8."/>
+      <w:lvlJc w:val="left"/>
+      <w:pPr>
+        <w:ind w:left="5760" w:hanging="360"/>
+      </w:pPr>
+    </w:lvl>
+    <w:lvl w:ilvl="8" w:tplc="0416001B" w:tentative="1">
+      <w:start w:val="1"/>
+      <w:numFmt w:val="lowerRoman"/>
+      <w:lvlText w:val="%9."/>
+      <w:lvlJc w:val="right"/>
+      <w:pPr>
+        <w:ind w:left="6480" w:hanging="180"/>
+      </w:pPr>
+    </w:lvl>
+  </w:abstractNum>
+  <w:abstractNum w:abstractNumId="4" w15:restartNumberingAfterBreak="0">
+    <w:nsid w:val="11A8187B"/>
+    <w:multiLevelType w:val="hybridMultilevel"/>
+    <w:tmpl w:val="27DC85E6"/>
+    <w:lvl w:ilvl="0" w:tplc="04160011">
+      <w:start w:val="1"/>
+      <w:numFmt w:val="decimal"/>
+      <w:lvlText w:val="%1)"/>
+      <w:lvlJc w:val="left"/>
+      <w:pPr>
+        <w:ind w:left="720" w:hanging="360"/>
+      </w:pPr>
+      <w:rPr>
+        <w:rFonts w:hint="default"/>
+      </w:rPr>
+    </w:lvl>
+    <w:lvl w:ilvl="1" w:tplc="04160019" w:tentative="1">
+      <w:start w:val="1"/>
+      <w:numFmt w:val="lowerLetter"/>
+      <w:lvlText w:val="%2."/>
+      <w:lvlJc w:val="left"/>
+      <w:pPr>
+        <w:ind w:left="1440" w:hanging="360"/>
+      </w:pPr>
+    </w:lvl>
+    <w:lvl w:ilvl="2" w:tplc="0416001B" w:tentative="1">
+      <w:start w:val="1"/>
+      <w:numFmt w:val="lowerRoman"/>
+      <w:lvlText w:val="%3."/>
+      <w:lvlJc w:val="right"/>
+      <w:pPr>
+        <w:ind w:left="2160" w:hanging="180"/>
+      </w:pPr>
+    </w:lvl>
+    <w:lvl w:ilvl="3" w:tplc="0416000F" w:tentative="1">
+      <w:start w:val="1"/>
+      <w:numFmt w:val="decimal"/>
+      <w:lvlText w:val="%4."/>
+      <w:lvlJc w:val="left"/>
+      <w:pPr>
+        <w:ind w:left="2880" w:hanging="360"/>
+      </w:pPr>
+    </w:lvl>
+    <w:lvl w:ilvl="4" w:tplc="04160019" w:tentative="1">
+      <w:start w:val="1"/>
+      <w:numFmt w:val="lowerLetter"/>
+      <w:lvlText w:val="%5."/>
+      <w:lvlJc w:val="left"/>
+      <w:pPr>
+        <w:ind w:left="3600" w:hanging="360"/>
+      </w:pPr>
+    </w:lvl>
+    <w:lvl w:ilvl="5" w:tplc="0416001B" w:tentative="1">
+      <w:start w:val="1"/>
+      <w:numFmt w:val="lowerRoman"/>
+      <w:lvlText w:val="%6."/>
+      <w:lvlJc w:val="right"/>
+      <w:pPr>
+        <w:ind w:left="4320" w:hanging="180"/>
+      </w:pPr>
+    </w:lvl>
+    <w:lvl w:ilvl="6" w:tplc="0416000F" w:tentative="1">
+      <w:start w:val="1"/>
+      <w:numFmt w:val="decimal"/>
+      <w:lvlText w:val="%7."/>
+      <w:lvlJc w:val="left"/>
+      <w:pPr>
+        <w:ind w:left="5040" w:hanging="360"/>
+      </w:pPr>
+    </w:lvl>
+    <w:lvl w:ilvl="7" w:tplc="04160019" w:tentative="1">
+      <w:start w:val="1"/>
+      <w:numFmt w:val="lowerLetter"/>
+      <w:lvlText w:val="%8."/>
+      <w:lvlJc w:val="left"/>
+      <w:pPr>
+        <w:ind w:left="5760" w:hanging="360"/>
+      </w:pPr>
+    </w:lvl>
+    <w:lvl w:ilvl="8" w:tplc="0416001B" w:tentative="1">
+      <w:start w:val="1"/>
+      <w:numFmt w:val="lowerRoman"/>
+      <w:lvlText w:val="%9."/>
+      <w:lvlJc w:val="right"/>
+      <w:pPr>
+        <w:ind w:left="6480" w:hanging="180"/>
+      </w:pPr>
+    </w:lvl>
+  </w:abstractNum>
+  <w:abstractNum w:abstractNumId="5" w15:restartNumberingAfterBreak="0">
+    <w:nsid w:val="1C0357FD"/>
+    <w:multiLevelType w:val="hybridMultilevel"/>
+    <w:tmpl w:val="22346E22"/>
+    <w:lvl w:ilvl="0" w:tplc="A0C6696E">
+      <w:start w:val="1"/>
+      <w:numFmt w:val="lowerLetter"/>
+      <w:lvlText w:val="%1-"/>
+      <w:lvlJc w:val="left"/>
+      <w:pPr>
+        <w:ind w:left="720" w:hanging="360"/>
+      </w:pPr>
+      <w:rPr>
+        <w:rFonts w:hint="default"/>
+      </w:rPr>
+    </w:lvl>
+    <w:lvl w:ilvl="1" w:tplc="04160019" w:tentative="1">
+      <w:start w:val="1"/>
+      <w:numFmt w:val="lowerLetter"/>
+      <w:lvlText w:val="%2."/>
+      <w:lvlJc w:val="left"/>
+      <w:pPr>
+        <w:ind w:left="1440" w:hanging="360"/>
+      </w:pPr>
+    </w:lvl>
+    <w:lvl w:ilvl="2" w:tplc="0416001B" w:tentative="1">
+      <w:start w:val="1"/>
+      <w:numFmt w:val="lowerRoman"/>
+      <w:lvlText w:val="%3."/>
+      <w:lvlJc w:val="right"/>
+      <w:pPr>
+        <w:ind w:left="2160" w:hanging="180"/>
+      </w:pPr>
+    </w:lvl>
+    <w:lvl w:ilvl="3" w:tplc="0416000F" w:tentative="1">
+      <w:start w:val="1"/>
+      <w:numFmt w:val="decimal"/>
+      <w:lvlText w:val="%4."/>
+      <w:lvlJc w:val="left"/>
+      <w:pPr>
+        <w:ind w:left="2880" w:hanging="360"/>
+      </w:pPr>
+    </w:lvl>
+    <w:lvl w:ilvl="4" w:tplc="04160019" w:tentative="1">
+      <w:start w:val="1"/>
+      <w:numFmt w:val="lowerLetter"/>
+      <w:lvlText w:val="%5."/>
+      <w:lvlJc w:val="left"/>
+      <w:pPr>
+        <w:ind w:left="3600" w:hanging="360"/>
+      </w:pPr>
+    </w:lvl>
+    <w:lvl w:ilvl="5" w:tplc="0416001B" w:tentative="1">
+      <w:start w:val="1"/>
+      <w:numFmt w:val="lowerRoman"/>
+      <w:lvlText w:val="%6."/>
+      <w:lvlJc w:val="right"/>
+      <w:pPr>
+        <w:ind w:left="4320" w:hanging="180"/>
+      </w:pPr>
+    </w:lvl>
+    <w:lvl w:ilvl="6" w:tplc="0416000F" w:tentative="1">
+      <w:start w:val="1"/>
+      <w:numFmt w:val="decimal"/>
+      <w:lvlText w:val="%7."/>
+      <w:lvlJc w:val="left"/>
+      <w:pPr>
+        <w:ind w:left="5040" w:hanging="360"/>
+      </w:pPr>
+    </w:lvl>
+    <w:lvl w:ilvl="7" w:tplc="04160019" w:tentative="1">
+      <w:start w:val="1"/>
+      <w:numFmt w:val="lowerLetter"/>
+      <w:lvlText w:val="%8."/>
+      <w:lvlJc w:val="left"/>
+      <w:pPr>
+        <w:ind w:left="5760" w:hanging="360"/>
+      </w:pPr>
+    </w:lvl>
+    <w:lvl w:ilvl="8" w:tplc="0416001B" w:tentative="1">
+      <w:start w:val="1"/>
+      <w:numFmt w:val="lowerRoman"/>
+      <w:lvlText w:val="%9."/>
+      <w:lvlJc w:val="right"/>
+      <w:pPr>
+        <w:ind w:left="6480" w:hanging="180"/>
+      </w:pPr>
+    </w:lvl>
+  </w:abstractNum>
+  <w:abstractNum w:abstractNumId="6" w15:restartNumberingAfterBreak="0">
+    <w:nsid w:val="211B335F"/>
+    <w:multiLevelType w:val="hybridMultilevel"/>
+    <w:tmpl w:val="FB08EA32"/>
+    <w:lvl w:ilvl="0" w:tplc="04160017">
+      <w:start w:val="1"/>
+      <w:numFmt w:val="lowerLetter"/>
+      <w:lvlText w:val="%1)"/>
+      <w:lvlJc w:val="left"/>
+      <w:pPr>
+        <w:ind w:left="720" w:hanging="360"/>
+      </w:pPr>
+      <w:rPr>
+        <w:rFonts w:hint="default"/>
+      </w:rPr>
+    </w:lvl>
+    <w:lvl w:ilvl="1" w:tplc="04160019" w:tentative="1">
+      <w:start w:val="1"/>
+      <w:numFmt w:val="lowerLetter"/>
+      <w:lvlText w:val="%2."/>
+      <w:lvlJc w:val="left"/>
+      <w:pPr>
+        <w:ind w:left="1440" w:hanging="360"/>
+      </w:pPr>
+    </w:lvl>
+    <w:lvl w:ilvl="2" w:tplc="0416001B" w:tentative="1">
+      <w:start w:val="1"/>
+      <w:numFmt w:val="lowerRoman"/>
+      <w:lvlText w:val="%3."/>
+      <w:lvlJc w:val="right"/>
+      <w:pPr>
+        <w:ind w:left="2160" w:hanging="180"/>
+      </w:pPr>
+    </w:lvl>
+    <w:lvl w:ilvl="3" w:tplc="0416000F" w:tentative="1">
+      <w:start w:val="1"/>
+      <w:numFmt w:val="decimal"/>
+      <w:lvlText w:val="%4."/>
+      <w:lvlJc w:val="left"/>
+      <w:pPr>
+        <w:ind w:left="2880" w:hanging="360"/>
+      </w:pPr>
+    </w:lvl>
+    <w:lvl w:ilvl="4" w:tplc="04160019" w:tentative="1">
+      <w:start w:val="1"/>
+      <w:numFmt w:val="lowerLetter"/>
+      <w:lvlText w:val="%5."/>
+      <w:lvlJc w:val="left"/>
+      <w:pPr>
+        <w:ind w:left="3600" w:hanging="360"/>
+      </w:pPr>
+    </w:lvl>
+    <w:lvl w:ilvl="5" w:tplc="0416001B" w:tentative="1">
+      <w:start w:val="1"/>
+      <w:numFmt w:val="lowerRoman"/>
+      <w:lvlText w:val="%6."/>
+      <w:lvlJc w:val="right"/>
+      <w:pPr>
+        <w:ind w:left="4320" w:hanging="180"/>
+      </w:pPr>
+    </w:lvl>
+    <w:lvl w:ilvl="6" w:tplc="0416000F" w:tentative="1">
+      <w:start w:val="1"/>
+      <w:numFmt w:val="decimal"/>
+      <w:lvlText w:val="%7."/>
+      <w:lvlJc w:val="left"/>
+      <w:pPr>
+        <w:ind w:left="5040" w:hanging="360"/>
+      </w:pPr>
+    </w:lvl>
+    <w:lvl w:ilvl="7" w:tplc="04160019" w:tentative="1">
+      <w:start w:val="1"/>
+      <w:numFmt w:val="lowerLetter"/>
+      <w:lvlText w:val="%8."/>
+      <w:lvlJc w:val="left"/>
+      <w:pPr>
+        <w:ind w:left="5760" w:hanging="360"/>
+      </w:pPr>
+    </w:lvl>
+    <w:lvl w:ilvl="8" w:tplc="0416001B" w:tentative="1">
+      <w:start w:val="1"/>
+      <w:numFmt w:val="lowerRoman"/>
+      <w:lvlText w:val="%9."/>
+      <w:lvlJc w:val="right"/>
+      <w:pPr>
+        <w:ind w:left="6480" w:hanging="180"/>
+      </w:pPr>
+    </w:lvl>
+  </w:abstractNum>
+  <w:abstractNum w:abstractNumId="7" w15:restartNumberingAfterBreak="0">
+    <w:nsid w:val="24087651"/>
+    <w:multiLevelType w:val="hybridMultilevel"/>
+    <w:tmpl w:val="B0A2AD2E"/>
+    <w:lvl w:ilvl="0" w:tplc="418626F4">
+      <w:start w:val="1"/>
+      <w:numFmt w:val="decimal"/>
+      <w:lvlText w:val="%1-"/>
+      <w:lvlJc w:val="left"/>
+      <w:pPr>
+        <w:ind w:left="720" w:hanging="360"/>
+      </w:pPr>
+      <w:rPr>
+        <w:rFonts w:hint="default"/>
+      </w:rPr>
+    </w:lvl>
+    <w:lvl w:ilvl="1" w:tplc="04160019" w:tentative="1">
+      <w:start w:val="1"/>
+      <w:numFmt w:val="lowerLetter"/>
+      <w:lvlText w:val="%2."/>
+      <w:lvlJc w:val="left"/>
+      <w:pPr>
+        <w:ind w:left="1440" w:hanging="360"/>
+      </w:pPr>
+    </w:lvl>
+    <w:lvl w:ilvl="2" w:tplc="0416001B" w:tentative="1">
+      <w:start w:val="1"/>
+      <w:numFmt w:val="lowerRoman"/>
+      <w:lvlText w:val="%3."/>
+      <w:lvlJc w:val="right"/>
+      <w:pPr>
+        <w:ind w:left="2160" w:hanging="180"/>
+      </w:pPr>
+    </w:lvl>
+    <w:lvl w:ilvl="3" w:tplc="0416000F" w:tentative="1">
+      <w:start w:val="1"/>
+      <w:numFmt w:val="decimal"/>
+      <w:lvlText w:val="%4."/>
+      <w:lvlJc w:val="left"/>
+      <w:pPr>
+        <w:ind w:left="2880" w:hanging="360"/>
+      </w:pPr>
+    </w:lvl>
+    <w:lvl w:ilvl="4" w:tplc="04160019" w:tentative="1">
+      <w:start w:val="1"/>
+      <w:numFmt w:val="lowerLetter"/>
+      <w:lvlText w:val="%5."/>
+      <w:lvlJc w:val="left"/>
+      <w:pPr>
+        <w:ind w:left="3600" w:hanging="360"/>
+      </w:pPr>
+    </w:lvl>
+    <w:lvl w:ilvl="5" w:tplc="0416001B" w:tentative="1">
+      <w:start w:val="1"/>
+      <w:numFmt w:val="lowerRoman"/>
+      <w:lvlText w:val="%6."/>
+      <w:lvlJc w:val="right"/>
+      <w:pPr>
+        <w:ind w:left="4320" w:hanging="180"/>
+      </w:pPr>
+    </w:lvl>
+    <w:lvl w:ilvl="6" w:tplc="0416000F" w:tentative="1">
+      <w:start w:val="1"/>
+      <w:numFmt w:val="decimal"/>
+      <w:lvlText w:val="%7."/>
+      <w:lvlJc w:val="left"/>
+      <w:pPr>
+        <w:ind w:left="5040" w:hanging="360"/>
+      </w:pPr>
+    </w:lvl>
+    <w:lvl w:ilvl="7" w:tplc="04160019" w:tentative="1">
+      <w:start w:val="1"/>
+      <w:numFmt w:val="lowerLetter"/>
+      <w:lvlText w:val="%8."/>
+      <w:lvlJc w:val="left"/>
+      <w:pPr>
+        <w:ind w:left="5760" w:hanging="360"/>
+      </w:pPr>
+    </w:lvl>
+    <w:lvl w:ilvl="8" w:tplc="0416001B" w:tentative="1">
+      <w:start w:val="1"/>
+      <w:numFmt w:val="lowerRoman"/>
+      <w:lvlText w:val="%9."/>
+      <w:lvlJc w:val="right"/>
+      <w:pPr>
+        <w:ind w:left="6480" w:hanging="180"/>
+      </w:pPr>
+    </w:lvl>
+  </w:abstractNum>
+  <w:abstractNum w:abstractNumId="8" w15:restartNumberingAfterBreak="0">
     <w:nsid w:val="2C8A66F4"/>
     <w:multiLevelType w:val="hybridMultilevel"/>
     <w:tmpl w:val="76C0FDCC"/>
@@ -320,7 +1164,7 @@
       </w:pPr>
     </w:lvl>
   </w:abstractNum>
-  <w:abstractNum w:abstractNumId="2" w15:restartNumberingAfterBreak="0">
+  <w:abstractNum w:abstractNumId="9" w15:restartNumberingAfterBreak="0">
     <w:nsid w:val="482744C1"/>
     <w:multiLevelType w:val="hybridMultilevel"/>
     <w:tmpl w:val="35A4473A"/>
@@ -409,7 +1253,96 @@
       </w:pPr>
     </w:lvl>
   </w:abstractNum>
-  <w:abstractNum w:abstractNumId="3" w15:restartNumberingAfterBreak="0">
+  <w:abstractNum w:abstractNumId="10" w15:restartNumberingAfterBreak="0">
+    <w:nsid w:val="49157822"/>
+    <w:multiLevelType w:val="hybridMultilevel"/>
+    <w:tmpl w:val="B6BA9FC8"/>
+    <w:lvl w:ilvl="0" w:tplc="FF38AD38">
+      <w:start w:val="1"/>
+      <w:numFmt w:val="lowerLetter"/>
+      <w:lvlText w:val="%1-"/>
+      <w:lvlJc w:val="left"/>
+      <w:pPr>
+        <w:ind w:left="720" w:hanging="360"/>
+      </w:pPr>
+      <w:rPr>
+        <w:rFonts w:hint="default"/>
+      </w:rPr>
+    </w:lvl>
+    <w:lvl w:ilvl="1" w:tplc="04160019" w:tentative="1">
+      <w:start w:val="1"/>
+      <w:numFmt w:val="lowerLetter"/>
+      <w:lvlText w:val="%2."/>
+      <w:lvlJc w:val="left"/>
+      <w:pPr>
+        <w:ind w:left="1440" w:hanging="360"/>
+      </w:pPr>
+    </w:lvl>
+    <w:lvl w:ilvl="2" w:tplc="0416001B" w:tentative="1">
+      <w:start w:val="1"/>
+      <w:numFmt w:val="lowerRoman"/>
+      <w:lvlText w:val="%3."/>
+      <w:lvlJc w:val="right"/>
+      <w:pPr>
+        <w:ind w:left="2160" w:hanging="180"/>
+      </w:pPr>
+    </w:lvl>
+    <w:lvl w:ilvl="3" w:tplc="0416000F" w:tentative="1">
+      <w:start w:val="1"/>
+      <w:numFmt w:val="decimal"/>
+      <w:lvlText w:val="%4."/>
+      <w:lvlJc w:val="left"/>
+      <w:pPr>
+        <w:ind w:left="2880" w:hanging="360"/>
+      </w:pPr>
+    </w:lvl>
+    <w:lvl w:ilvl="4" w:tplc="04160019" w:tentative="1">
+      <w:start w:val="1"/>
+      <w:numFmt w:val="lowerLetter"/>
+      <w:lvlText w:val="%5."/>
+      <w:lvlJc w:val="left"/>
+      <w:pPr>
+        <w:ind w:left="3600" w:hanging="360"/>
+      </w:pPr>
+    </w:lvl>
+    <w:lvl w:ilvl="5" w:tplc="0416001B" w:tentative="1">
+      <w:start w:val="1"/>
+      <w:numFmt w:val="lowerRoman"/>
+      <w:lvlText w:val="%6."/>
+      <w:lvlJc w:val="right"/>
+      <w:pPr>
+        <w:ind w:left="4320" w:hanging="180"/>
+      </w:pPr>
+    </w:lvl>
+    <w:lvl w:ilvl="6" w:tplc="0416000F" w:tentative="1">
+      <w:start w:val="1"/>
+      <w:numFmt w:val="decimal"/>
+      <w:lvlText w:val="%7."/>
+      <w:lvlJc w:val="left"/>
+      <w:pPr>
+        <w:ind w:left="5040" w:hanging="360"/>
+      </w:pPr>
+    </w:lvl>
+    <w:lvl w:ilvl="7" w:tplc="04160019" w:tentative="1">
+      <w:start w:val="1"/>
+      <w:numFmt w:val="lowerLetter"/>
+      <w:lvlText w:val="%8."/>
+      <w:lvlJc w:val="left"/>
+      <w:pPr>
+        <w:ind w:left="5760" w:hanging="360"/>
+      </w:pPr>
+    </w:lvl>
+    <w:lvl w:ilvl="8" w:tplc="0416001B" w:tentative="1">
+      <w:start w:val="1"/>
+      <w:numFmt w:val="lowerRoman"/>
+      <w:lvlText w:val="%9."/>
+      <w:lvlJc w:val="right"/>
+      <w:pPr>
+        <w:ind w:left="6480" w:hanging="180"/>
+      </w:pPr>
+    </w:lvl>
+  </w:abstractNum>
+  <w:abstractNum w:abstractNumId="11" w15:restartNumberingAfterBreak="0">
     <w:nsid w:val="5078422C"/>
     <w:multiLevelType w:val="hybridMultilevel"/>
     <w:tmpl w:val="0876DE2A"/>
@@ -499,7 +1432,7 @@
       </w:pPr>
     </w:lvl>
   </w:abstractNum>
-  <w:abstractNum w:abstractNumId="4" w15:restartNumberingAfterBreak="0">
+  <w:abstractNum w:abstractNumId="12" w15:restartNumberingAfterBreak="0">
     <w:nsid w:val="65EC5E0D"/>
     <w:multiLevelType w:val="multilevel"/>
     <w:tmpl w:val="D5968A7E"/>
@@ -590,20 +1523,136 @@
       </w:pPr>
     </w:lvl>
   </w:abstractNum>
+  <w:abstractNum w:abstractNumId="13" w15:restartNumberingAfterBreak="0">
+    <w:nsid w:val="69553269"/>
+    <w:multiLevelType w:val="hybridMultilevel"/>
+    <w:tmpl w:val="4784F08C"/>
+    <w:lvl w:ilvl="0" w:tplc="04160017">
+      <w:start w:val="1"/>
+      <w:numFmt w:val="lowerLetter"/>
+      <w:lvlText w:val="%1)"/>
+      <w:lvlJc w:val="left"/>
+      <w:pPr>
+        <w:ind w:left="720" w:hanging="360"/>
+      </w:pPr>
+      <w:rPr>
+        <w:rFonts w:hint="default"/>
+      </w:rPr>
+    </w:lvl>
+    <w:lvl w:ilvl="1" w:tplc="04160019" w:tentative="1">
+      <w:start w:val="1"/>
+      <w:numFmt w:val="lowerLetter"/>
+      <w:lvlText w:val="%2."/>
+      <w:lvlJc w:val="left"/>
+      <w:pPr>
+        <w:ind w:left="1440" w:hanging="360"/>
+      </w:pPr>
+    </w:lvl>
+    <w:lvl w:ilvl="2" w:tplc="0416001B" w:tentative="1">
+      <w:start w:val="1"/>
+      <w:numFmt w:val="lowerRoman"/>
+      <w:lvlText w:val="%3."/>
+      <w:lvlJc w:val="right"/>
+      <w:pPr>
+        <w:ind w:left="2160" w:hanging="180"/>
+      </w:pPr>
+    </w:lvl>
+    <w:lvl w:ilvl="3" w:tplc="0416000F" w:tentative="1">
+      <w:start w:val="1"/>
+      <w:numFmt w:val="decimal"/>
+      <w:lvlText w:val="%4."/>
+      <w:lvlJc w:val="left"/>
+      <w:pPr>
+        <w:ind w:left="2880" w:hanging="360"/>
+      </w:pPr>
+    </w:lvl>
+    <w:lvl w:ilvl="4" w:tplc="04160019" w:tentative="1">
+      <w:start w:val="1"/>
+      <w:numFmt w:val="lowerLetter"/>
+      <w:lvlText w:val="%5."/>
+      <w:lvlJc w:val="left"/>
+      <w:pPr>
+        <w:ind w:left="3600" w:hanging="360"/>
+      </w:pPr>
+    </w:lvl>
+    <w:lvl w:ilvl="5" w:tplc="0416001B" w:tentative="1">
+      <w:start w:val="1"/>
+      <w:numFmt w:val="lowerRoman"/>
+      <w:lvlText w:val="%6."/>
+      <w:lvlJc w:val="right"/>
+      <w:pPr>
+        <w:ind w:left="4320" w:hanging="180"/>
+      </w:pPr>
+    </w:lvl>
+    <w:lvl w:ilvl="6" w:tplc="0416000F" w:tentative="1">
+      <w:start w:val="1"/>
+      <w:numFmt w:val="decimal"/>
+      <w:lvlText w:val="%7."/>
+      <w:lvlJc w:val="left"/>
+      <w:pPr>
+        <w:ind w:left="5040" w:hanging="360"/>
+      </w:pPr>
+    </w:lvl>
+    <w:lvl w:ilvl="7" w:tplc="04160019" w:tentative="1">
+      <w:start w:val="1"/>
+      <w:numFmt w:val="lowerLetter"/>
+      <w:lvlText w:val="%8."/>
+      <w:lvlJc w:val="left"/>
+      <w:pPr>
+        <w:ind w:left="5760" w:hanging="360"/>
+      </w:pPr>
+    </w:lvl>
+    <w:lvl w:ilvl="8" w:tplc="0416001B" w:tentative="1">
+      <w:start w:val="1"/>
+      <w:numFmt w:val="lowerRoman"/>
+      <w:lvlText w:val="%9."/>
+      <w:lvlJc w:val="right"/>
+      <w:pPr>
+        <w:ind w:left="6480" w:hanging="180"/>
+      </w:pPr>
+    </w:lvl>
+  </w:abstractNum>
   <w:num w:numId="1" w16cid:durableId="1686588670">
     <w:abstractNumId w:val="0"/>
   </w:num>
   <w:num w:numId="2" w16cid:durableId="337775200">
+    <w:abstractNumId w:val="8"/>
+  </w:num>
+  <w:num w:numId="3" w16cid:durableId="186723114">
+    <w:abstractNumId w:val="9"/>
+  </w:num>
+  <w:num w:numId="4" w16cid:durableId="1222715297">
+    <w:abstractNumId w:val="11"/>
+  </w:num>
+  <w:num w:numId="5" w16cid:durableId="1493763603">
+    <w:abstractNumId w:val="12"/>
+  </w:num>
+  <w:num w:numId="6" w16cid:durableId="1707827052">
+    <w:abstractNumId w:val="6"/>
+  </w:num>
+  <w:num w:numId="7" w16cid:durableId="1579290506">
+    <w:abstractNumId w:val="2"/>
+  </w:num>
+  <w:num w:numId="8" w16cid:durableId="399400240">
+    <w:abstractNumId w:val="5"/>
+  </w:num>
+  <w:num w:numId="9" w16cid:durableId="1419131881">
+    <w:abstractNumId w:val="7"/>
+  </w:num>
+  <w:num w:numId="10" w16cid:durableId="705179914">
+    <w:abstractNumId w:val="10"/>
+  </w:num>
+  <w:num w:numId="11" w16cid:durableId="725370417">
+    <w:abstractNumId w:val="4"/>
+  </w:num>
+  <w:num w:numId="12" w16cid:durableId="530218019">
+    <w:abstractNumId w:val="13"/>
+  </w:num>
+  <w:num w:numId="13" w16cid:durableId="480973977">
     <w:abstractNumId w:val="1"/>
   </w:num>
-  <w:num w:numId="3" w16cid:durableId="186723114">
-    <w:abstractNumId w:val="2"/>
-  </w:num>
-  <w:num w:numId="4" w16cid:durableId="1222715297">
+  <w:num w:numId="14" w16cid:durableId="1522209354">
     <w:abstractNumId w:val="3"/>
-  </w:num>
-  <w:num w:numId="5" w16cid:durableId="1493763603">
-    <w:abstractNumId w:val="4"/>
   </w:num>
 </w:numbering>
 </file>

</xml_diff>